<commit_message>
Update Technical Design Document for Exercise 6.docx
</commit_message>
<xml_diff>
--- a/EXERCISE 6/Technical Design Document for Exercise 6.docx
+++ b/EXERCISE 6/Technical Design Document for Exercise 6.docx
@@ -1376,21 +1376,30 @@
           <w14:ligatures w14:val="none"/>
         </w:rPr>
         <w:br/>
-        <w:t xml:space="preserve">Link to your repository: </w:t>
-      </w:r>
-      <w:hyperlink r:id="rId5" w:history="1">
-        <w:r>
-          <w:rPr>
-            <w:rStyle w:val="Hyperlink"/>
-            <w:rFonts w:ascii="Courier New" w:eastAsia="Times New Roman" w:hAnsi="Courier New" w:cs="Courier New"/>
-            <w:kern w:val="0"/>
-            <w:sz w:val="20"/>
-            <w:szCs w:val="20"/>
-            <w14:ligatures w14:val="none"/>
-          </w:rPr>
-          <w:t>www.repository.com</w:t>
-        </w:r>
-      </w:hyperlink>
+        <w:t>Link to your repository</w:t>
+      </w:r>
+      <w:r>
+        <w:rPr>
+          <w:rFonts w:ascii="Courier New" w:eastAsia="Times New Roman" w:hAnsi="Courier New" w:cs="Courier New"/>
+          <w:color w:val="080808"/>
+          <w:kern w:val="0"/>
+          <w:sz w:val="20"/>
+          <w:szCs w:val="20"/>
+          <w14:ligatures w14:val="none"/>
+        </w:rPr>
+        <w:t xml:space="preserve">: </w:t>
+      </w:r>
+      <w:r>
+        <w:rPr>
+          <w:rFonts w:ascii="Courier New" w:eastAsia="Times New Roman" w:hAnsi="Courier New" w:cs="Courier New"/>
+          <w:color w:val="080808"/>
+          <w:kern w:val="0"/>
+          <w:sz w:val="20"/>
+          <w:szCs w:val="20"/>
+          <w14:ligatures w14:val="none"/>
+        </w:rPr>
+        <w:t>https://github.com/hadihoc/COP2373</w:t>
+      </w:r>
     </w:p>
     <w:p>
       <w:pPr>
@@ -1457,7 +1466,7 @@
                     <pic:cNvPicPr/>
                   </pic:nvPicPr>
                   <pic:blipFill>
-                    <a:blip r:embed="rId6"/>
+                    <a:blip r:embed="rId5"/>
                     <a:stretch>
                       <a:fillRect/>
                     </a:stretch>

</xml_diff>